<commit_message>
docs: record verified Convex environment reset
</commit_message>
<xml_diff>
--- a/output/docx/luma-green-platform-refinement-interview.docx
+++ b/output/docx/luma-green-platform-refinement-interview.docx
@@ -2123,7 +2123,7 @@
     </w:p>
     <w:p>
       <w:r>
-        <w:t>This is the working implementation map for the full workbook request. Each slice must keep current data readable, include permission and failure tests, update the user guide for visible behavior and pass the repository release checks. The production release is the final verified result, not a substitute for deciding an open contract.</w:t>
+        <w:t>This is the working implementation map for the full workbook request. Each slice must include permission and failure tests, update the user guide for visible behavior and pass the repository release checks. The production release is the final verified result, not a substitute for deciding an open contract.</w:t>
       </w:r>
     </w:p>
     <w:p>
@@ -2141,7 +2141,7 @@
         <w:t>Accounts and sites:</w:t>
       </w:r>
       <w:r>
-        <w:t xml:space="preserve"> keep existing users; add approved participant accounts, facility/site activity and material-origin facts. Separate trading rights from read-only, sponsor, lender, city and audit rights. Verify each role's onboarding and cross-organisation access.</w:t>
+        <w:t xml:space="preserve"> create new participant accounts, facility/site activity and material-origin facts. Separate trading rights from read-only, sponsor, lender, city and audit rights. Verify each role's onboarding and cross-organisation access.</w:t>
       </w:r>
     </w:p>
     <w:p>
@@ -2159,7 +2159,7 @@
         <w:t>Material catalogue and custody:</w:t>
       </w:r>
       <w:r>
-        <w:t xml:space="preserve"> define material forms and buyer-grade specifications. Record source, lot, transfer, transformation, byproducts, losses and accepted integer grams. Preserve the old inventory owner until a tested reconciliation explains how the new lot records connect to it.</w:t>
+        <w:t xml:space="preserve"> define material forms and buyer-grade specifications. Record source, lot, transfer, transformation, byproducts, losses and accepted integer grams. Keep the inventory owner separate until a tested reconciliation explains how new lot records connect to it.</w:t>
       </w:r>
     </w:p>
     <w:p>
@@ -2277,7 +2277,7 @@
         <w:t>pnpm check</w:t>
       </w:r>
       <w:r>
-        <w:t xml:space="preserve">, build, required browser tests and an actual preview. Check Convex schema compatibility against deployed rows before a backend release. Merge through protected </w:t>
+        <w:t xml:space="preserve">, build, required browser tests and an actual preview. Both prior Convex deployments were reset to zero rows on 6 October; validate the new schema before the backend release. Merge through protected </w:t>
       </w:r>
       <w:r>
         <w:rPr>
@@ -2306,6 +2306,48 @@
     <w:p>
       <w:r>
         <w:t>The current market only supports the prototype's next-step trading graph. The manufacturer-byproduct buyer rule must be implemented and tested before it is presented as available. The prototype's simulated escrow path must be closed before any live B2B use. The account-request API needs the corresponding customer and admin screens before teams can use those roles through the app. Neither a gateway provider nor a production gateway account has been approved in this interview.</w:t>
+      </w:r>
+    </w:p>
+    <w:p>
+      <w:pPr>
+        <w:pStyle w:val="Heading2"/>
+      </w:pPr>
+      <w:r>
+        <w:t>6 October 2026 full Convex reset</w:t>
+      </w:r>
+    </w:p>
+    <w:p>
+      <w:r>
+        <w:t xml:space="preserve">The founder approved removing all prototype records from development and production. The saved development and production export archives passed ZIP integrity checks before deletion. After the empty schema unmounted Better Auth, the remaining application tables, Better Auth component records and stored files were deleted. Fresh checks of </w:t>
+      </w:r>
+      <w:r>
+        <w:rPr>
+          <w:rFonts w:ascii="Liberation Mono" w:hAnsi="Liberation Mono"/>
+          <w:sz w:val="17"/>
+        </w:rPr>
+        <w:t>glorious-rooster-470</w:t>
+      </w:r>
+      <w:r>
+        <w:t xml:space="preserve"> and </w:t>
+      </w:r>
+      <w:r>
+        <w:rPr>
+          <w:rFonts w:ascii="Liberation Mono" w:hAnsi="Liberation Mono"/>
+          <w:sz w:val="17"/>
+        </w:rPr>
+        <w:t>outstanding-buzzard-942</w:t>
+      </w:r>
+      <w:r>
+        <w:t xml:space="preserve"> each returned </w:t>
+      </w:r>
+      <w:r>
+        <w:rPr>
+          <w:b/>
+        </w:rPr>
+        <w:t>zero tables, rows, users, stored files, functions and crons</w:t>
+      </w:r>
+      <w:r>
+        <w:t>. Both deployments remain paused until the reviewed new backend is deployed. The exports are recovery archives, not active data. This reset removes old-data migration as a release constraint; new data and future schema changes still require ordinary migration care.</w:t>
       </w:r>
     </w:p>
     <w:p>

</xml_diff>

<commit_message>
docs(docs): plan team accounts and local acceptance
</commit_message>
<xml_diff>
--- a/output/docx/luma-green-platform-refinement-interview.docx
+++ b/output/docx/luma-green-platform-refinement-interview.docx
@@ -2085,7 +2085,19 @@
         <w:pStyle w:val="ListBullet"/>
       </w:pPr>
       <w:r>
-        <w:t>All B2B payment must go through a payment gateway once connected. Do not offer direct settlement, manual/off-platform payment approval or simulated escrow as a live transaction path. Orders, inspections and custody records may exist without a completed payment; payment-dependent actions must wait for verified gateway state. The gateway provider and live account remain open at this entry.</w:t>
+        <w:t xml:space="preserve">All B2B payment must go through a payment gateway once connected. Do not offer direct settlement, manual/off-platform payment approval or simulated escrow as a live transaction path. Orders, inspections and custody records may exist without a completed payment; payment-dependent actions must wait for verified gateway state. The gateway provider and live account remain open at this entry. </w:t>
+      </w:r>
+      <w:hyperlink r:id="rId14">
+        <w:r>
+          <w:rPr>
+            <w:color w:val="175C73"/>
+            <w:u w:val="single"/>
+          </w:rPr>
+          <w:t>ADR 0019</w:t>
+        </w:r>
+      </w:hyperlink>
+      <w:r>
+        <w:t xml:space="preserve"> records this boundary.</w:t>
       </w:r>
     </w:p>
     <w:p>
@@ -2352,6 +2364,197 @@
     </w:p>
     <w:p>
       <w:pPr>
+        <w:pStyle w:val="Heading2"/>
+      </w:pPr>
+      <w:r>
+        <w:t>6 October 2026 proposed account workspace and local acceptance plan</w:t>
+      </w:r>
+    </w:p>
+    <w:p>
+      <w:r>
+        <w:rPr>
+          <w:b/>
+        </w:rPr>
+        <w:t>Approval status:</w:t>
+      </w:r>
+      <w:r>
+        <w:t xml:space="preserve"> the founder asked to review this plan before implementation. The choices below are approved interview inputs, not a claim that the screens, test users or credentials already exist. Do not start this new scope until the founder approves the plan.</w:t>
+      </w:r>
+    </w:p>
+    <w:p>
+      <w:r>
+        <w:rPr>
+          <w:b/>
+        </w:rPr>
+        <w:t>Confirmed inputs.</w:t>
+      </w:r>
+      <w:r>
+        <w:t xml:space="preserve"> Offer normal users both email-and-password and phone-OTP signup after the corresponding provider verifies the address or number. Use a development-only verification path for local browser tests without sending SMS or email. Create disposable development accounts, and provide their generated email addresses and passwords in a </w:t>
+      </w:r>
+      <w:r>
+        <w:rPr>
+          <w:b/>
+        </w:rPr>
+        <w:t>restricted credentials annex</w:t>
+      </w:r>
+      <w:r>
+        <w:t xml:space="preserve"> for the founder and test team. The shared platform guide and its Google Docs copy show the account roster, roles and test instructions but contain no passwords. Do not put passwords, admin setup tokens or authenticator secrets in Git, screenshots, logs or the shared guide. The annex is separate from the public or broadly shared guide, with access limited to the named test team. All test identities are clearly marked as synthetic, never customer or production accounts.</w:t>
+      </w:r>
+    </w:p>
+    <w:p>
+      <w:r>
+        <w:rPr>
+          <w:b/>
+        </w:rPr>
+        <w:t>Feasibility boundary.</w:t>
+      </w:r>
+      <w:r>
+        <w:t xml:space="preserve"> Today the Better Auth integration supports phone OTP for normal users and email/password for the sole admin. It blocks normal-user email signup and has no team-invitation lifecycle. A new email path must change server policy, forms and the Better Auth adapter together, while keeping admin TOTP and recovery separate. Verified email linking to a phone identity must require proof of both identifiers; matching typed values is not proof. Use the existing organisation and membership records as workspace authority, and assess the Better Auth organisation plugin in a short technical spike before choosing an invite mechanism. Do not create two conflicting owners of role grants. True local Convex deployment is available but is beta; prove Better Auth sessions, component persistence and file storage work in that mode before using it as the acceptance environment. If that gate fails, use an isolated disposable development deployment, never the paused production deployment.</w:t>
+      </w:r>
+    </w:p>
+    <w:p>
+      <w:r>
+        <w:rPr>
+          <w:b/>
+        </w:rPr>
+        <w:t>Account and workspace model to implement after approval.</w:t>
+      </w:r>
+      <w:r>
+        <w:t xml:space="preserve"> A person has one verified identity and may belong to more than one organisation. An organisation has a business or observer type, approval state, sites and one or more workspaces. Workspace roles begin with owner, admin, member and viewer; specific abilities such as inviting people, approving a trade, entering quality evidence, seeing prices or exporting reports are checked on the server, not inferred from a screen label. A founder/admin account manages platform verification and cannot silently join customer workspaces. Specialist observers receive purpose-limited access only after the data owner grants it. A stakeholder's account approval alone does not grant trade or private-data access. Every grant, invitation, revocation and sensitive action writes an audit event. Decide precise permission rows with the team before enabling each workflow.</w:t>
+      </w:r>
+    </w:p>
+    <w:p>
+      <w:r>
+        <w:rPr>
+          <w:b/>
+        </w:rPr>
+        <w:t>Invite and identity flow.</w:t>
+      </w:r>
+      <w:r>
+        <w:t xml:space="preserve"> A workspace owner or authorised admin enters a teammate's email, chooses a workspace role and sends a one-use, expiring invite. The recipient opens the invite, verifies email, signs up or signs in, accepts the named organisation and role, then sees only permitted screens. Existing members can change roles or revoke access; an expired, reused, revoked or wrong-email invite fails with a clear message. Recheck current membership on every server operation, so a revoked member loses access even if a browser tab is open. A phone-only person may use phone OTP normally, but email-based invite acceptance requires them to add and verify the invited email first. Do not merge accounts automatically. A later phone-number invite can be interviewed separately. Development test mode must be server-gated to local/disposable environments, never enabled by a browser flag or production URL.</w:t>
+      </w:r>
+    </w:p>
+    <w:p>
+      <w:r>
+        <w:rPr>
+          <w:b/>
+        </w:rPr>
+        <w:t>Disposable fixture roster.</w:t>
+      </w:r>
+      <w:r>
+        <w:t xml:space="preserve"> Seed one person for each distinct journey, plus two people in at least one workspace to exercise collaboration. Cover:</w:t>
+      </w:r>
+    </w:p>
+    <w:p>
+      <w:pPr>
+        <w:spacing w:after="40"/>
+        <w:ind w:left="432" w:hanging="317"/>
+      </w:pPr>
+      <w:r>
+        <w:t xml:space="preserve">1.  </w:t>
+      </w:r>
+      <w:r>
+        <w:t>Household member and household-team coordinator; kabadiwala owner and invited staff member; Saathi.</w:t>
+      </w:r>
+    </w:p>
+    <w:p>
+      <w:pPr>
+        <w:spacing w:after="40"/>
+        <w:ind w:left="432" w:hanging="317"/>
+      </w:pPr>
+      <w:r>
+        <w:t xml:space="preserve">2.  </w:t>
+      </w:r>
+      <w:r>
+        <w:t>Preprocessor, recycler and manufacturer buyer/seller; include a manufacturer offering a non-hazardous byproduct and another approved buyer handling it.</w:t>
+      </w:r>
+    </w:p>
+    <w:p>
+      <w:pPr>
+        <w:spacing w:after="40"/>
+        <w:ind w:left="432" w:hanging="317"/>
+      </w:pPr>
+      <w:r>
+        <w:t xml:space="preserve">3.  </w:t>
+      </w:r>
+      <w:r>
+        <w:t>Apartment community, office, hotel and resort representatives as separate non-household material generators; at least one generator site and one rejected or unapproved buyer fixture.</w:t>
+      </w:r>
+    </w:p>
+    <w:p>
+      <w:pPr>
+        <w:spacing w:after="40"/>
+        <w:ind w:left="432" w:hanging="317"/>
+      </w:pPr>
+      <w:r>
+        <w:t xml:space="preserve">4.  </w:t>
+      </w:r>
+      <w:r>
+        <w:t>Fibre, textile and garment manufacturer subtypes; apparel/packaging brand or PIBO where that journey differs.</w:t>
+      </w:r>
+    </w:p>
+    <w:p>
+      <w:pPr>
+        <w:spacing w:after="40"/>
+        <w:ind w:left="432" w:hanging="317"/>
+      </w:pPr>
+      <w:r>
+        <w:t xml:space="preserve">5.  </w:t>
+      </w:r>
+      <w:r>
+        <w:t>City official, CSR sponsor, lender, auditor and waste-picker union as separate least-privilege observer accounts; platform administrator.</w:t>
+      </w:r>
+    </w:p>
+    <w:p>
+      <w:r>
+        <w:t>Use synthetic names, reserved test email addresses and non-routable phone numbers. Create Better Auth identities through supported auth flows, not by writing its component tables directly. Seed domain records through validated application APIs or tightly scoped test-only setup functions. Give the seed a repeatable manifest and cleanup command, so it cannot run against production and rerunning it does not duplicate identities or material lots. Generate unique strong passwords for email accounts at execution time. The restricted annex will list environment, account name, email, password, workspace, role, expected starting screen and expiry/rotation date; phone-only and TOTP accounts instead list their test access procedure, without publishing codes or secrets. The founder can then distribute that annex to the named team. The shared guide will link to it only if the sharing boundary is verified.</w:t>
+      </w:r>
+    </w:p>
+    <w:p>
+      <w:r>
+        <w:rPr>
+          <w:b/>
+        </w:rPr>
+        <w:t>Real-browser acceptance matrix.</w:t>
+      </w:r>
+      <w:r>
+        <w:t xml:space="preserve"> Run the app against the isolated seeded backend and test as a person would: navigate, enter forms, receive local-only verification, sign in, reload, switch workspaces, invite and accept, attempt unauthorised screens, sign out and sign back in. Test both email and phone signup and login, duplicate identifier, wrong password/code, expired challenge, recovery, invite expiry/reuse/revocation and cross-organisation isolation. Walk household booking and kabadiwala receipt, each supported material hand-off, manufacturer byproduct offer to an approved buyer, inspection/correction, compliance evidence and observer views. Test a payment-dependent action with no gateway and require the explicit blocked state. Do not claim a completed B2B purchase until a real gateway sandbox and webhook reconciliation pass. Inspect browser console and failed network requests, keyboard focus, light/dark views, phone/tablet/desktop widths and affected translations including Arabic/Urdu RTL. Capture only synthetic data, and identify local screenshots as local evidence.</w:t>
+      </w:r>
+    </w:p>
+    <w:p>
+      <w:r>
+        <w:rPr>
+          <w:b/>
+        </w:rPr>
+        <w:t>Implementation order and proof gates after approval.</w:t>
+      </w:r>
+      <w:r>
+        <w:t xml:space="preserve"> (1) Freeze the account matrix and permissions; spike local Convex and Better Auth feasibility. (2) Implement identity methods and server-side dev verification guard with unit, handler and adapter tests. (3) Add workspace roles and invite lifecycle with permission, concurrency and revocation tests. (4) Add signup, login, workspace and team screens using the current UI and translation contracts. (5) Create and seed the disposable fixture roster and generate the restricted annex. (6) Run real-browser paths, correct failures, and review visual captures. (7) Update the source user guide, rebuild and inspect its Word copy, then update the existing Google Doc with the same reviewed source and verify sharing. (8) Run </w:t>
+      </w:r>
+      <w:r>
+        <w:rPr>
+          <w:rFonts w:ascii="Liberation Mono" w:hAnsi="Liberation Mono"/>
+          <w:sz w:val="17"/>
+        </w:rPr>
+        <w:t>pnpm check</w:t>
+      </w:r>
+      <w:r>
+        <w:t>, build, browser suite, protected-branch checks and the actual deployment smoke tests before making a release claim. Production credentials, provider secrets, delivery and payment remain separate gates.</w:t>
+      </w:r>
+    </w:p>
+    <w:p>
+      <w:r>
+        <w:rPr>
+          <w:b/>
+        </w:rPr>
+        <w:t>Decisions still needed during implementation.</w:t>
+      </w:r>
+      <w:r>
+        <w:t xml:space="preserve"> The exact email sender and domain, SMS provider availability, gateway provider, team invitation email delivery, permission details for each observer, and whether a phone-only person can later add a password need named owners. Missing providers must show an honest unavailable state; no preview challenge can produce a production session.</w:t>
+      </w:r>
+    </w:p>
+    <w:p>
+      <w:pPr>
         <w:pStyle w:val="Heading1"/>
       </w:pPr>
       <w:r>
@@ -2491,7 +2694,7 @@
       <w:r>
         <w:t xml:space="preserve">The founder clarified that GPS metadata embedded in photos is not needed. Location features must not depend on EXIF GPS data from a photo, including a photo transferred from a phone to a desktop. A transfer does not guarantee that metadata is removed: </w:t>
       </w:r>
-      <w:hyperlink r:id="rId14">
+      <w:hyperlink r:id="rId15">
         <w:r>
           <w:rPr>
             <w:color w:val="175C73"/>

</xml_diff>

<commit_message>
docs(docs): record approved launch test plan and setup gates
</commit_message>
<xml_diff>
--- a/output/docx/luma-green-platform-refinement-interview.docx
+++ b/output/docx/luma-green-platform-refinement-interview.docx
@@ -2367,7 +2367,7 @@
         <w:pStyle w:val="Heading2"/>
       </w:pPr>
       <w:r>
-        <w:t>6 October 2026 proposed account workspace and local acceptance plan</w:t>
+        <w:t>6 October 2026 approved account workspace and local acceptance plan</w:t>
       </w:r>
     </w:p>
     <w:p>
@@ -2378,7 +2378,7 @@
         <w:t>Approval status:</w:t>
       </w:r>
       <w:r>
-        <w:t xml:space="preserve"> the founder asked to review this plan before implementation. The choices below are approved interview inputs, not a claim that the screens, test users or credentials already exist. Do not start this new scope until the founder approves the plan.</w:t>
+        <w:t xml:space="preserve"> approved by the founder on 6 October 2026 with “Go ahead, don’t wait on me.” Proceed with implementation and tests. This approval is not a claim that screens, test users, credentials or provider delivery already work.</w:t>
       </w:r>
     </w:p>
     <w:p>
@@ -2409,7 +2409,7 @@
         <w:t>Feasibility boundary.</w:t>
       </w:r>
       <w:r>
-        <w:t xml:space="preserve"> Today the Better Auth integration supports phone OTP for normal users and email/password for the sole admin. It blocks normal-user email signup and has no team-invitation lifecycle. A new email path must change server policy, forms and the Better Auth adapter together, while keeping admin TOTP and recovery separate. Verified email linking to a phone identity must require proof of both identifiers; matching typed values is not proof. Use the existing organisation and membership records as workspace authority, and assess the Better Auth organisation plugin in a short technical spike before choosing an invite mechanism. Do not create two conflicting owners of role grants. True local Convex deployment is available but is beta; prove Better Auth sessions, component persistence and file storage work in that mode before using it as the acceptance environment. If that gate fails, use an isolated disposable development deployment, never the paused production deployment.</w:t>
+        <w:t xml:space="preserve"> Today the Better Auth integration supports phone OTP for normal users and email/password for the sole admin. It blocks normal-user email signup and has no team-invitation lifecycle. A new email path must change server policy, forms and the Better Auth adapter together, while keeping admin TOTP and recovery separate. Verified email linking to a phone identity must require proof of both identifiers; matching typed values is not proof. Use the existing organisation and membership records as workspace authority, and assess the Better Auth organisation plugin in a short technical spike before choosing an invite mechanism. Do not create two conflicting owners of role grants. True local Convex deployment is available but is beta; prove Better Auth sessions, component persistence and file storage work in that mode before using it as the acceptance environment. Disposable identities and development verification must remain strictly local. If that gate fails, fix or report the blocker; do not switch to a cloud deployment without a new explicit decision.</w:t>
       </w:r>
     </w:p>
     <w:p>
@@ -2417,7 +2417,7 @@
         <w:rPr>
           <w:b/>
         </w:rPr>
-        <w:t>Account and workspace model to implement after approval.</w:t>
+        <w:t>Approved account and workspace model.</w:t>
       </w:r>
       <w:r>
         <w:t xml:space="preserve"> A person has one verified identity and may belong to more than one organisation. An organisation has a business or observer type, approval state, sites and one or more workspaces. Workspace roles begin with owner, admin, member and viewer; specific abilities such as inviting people, approving a trade, entering quality evidence, seeing prices or exporting reports are checked on the server, not inferred from a screen label. A founder/admin account manages platform verification and cannot silently join customer workspaces. Specialist observers receive purpose-limited access only after the data owner grants it. A stakeholder's account approval alone does not grant trade or private-data access. Every grant, invitation, revocation and sensitive action writes an audit event. Decide precise permission rows with the team before enabling each workflow.</w:t>
@@ -2431,7 +2431,7 @@
         <w:t>Invite and identity flow.</w:t>
       </w:r>
       <w:r>
-        <w:t xml:space="preserve"> A workspace owner or authorised admin enters a teammate's email, chooses a workspace role and sends a one-use, expiring invite. The recipient opens the invite, verifies email, signs up or signs in, accepts the named organisation and role, then sees only permitted screens. Existing members can change roles or revoke access; an expired, reused, revoked or wrong-email invite fails with a clear message. Recheck current membership on every server operation, so a revoked member loses access even if a browser tab is open. A phone-only person may use phone OTP normally, but email-based invite acceptance requires them to add and verify the invited email first. Do not merge accounts automatically. A later phone-number invite can be interviewed separately. Development test mode must be server-gated to local/disposable environments, never enabled by a browser flag or production URL.</w:t>
+        <w:t xml:space="preserve"> A workspace owner or authorised admin enters a teammate's email, chooses a workspace role and sends a one-use, expiring invite. The recipient opens the invite, verifies email, signs up or signs in, accepts the named organisation and role, then sees only permitted screens. Existing members can change roles or revoke access; an expired, reused, revoked or wrong-email invite fails with a clear message. Recheck current membership on every server operation, so a revoked member loses access even if a browser tab is open. A phone-only person may use phone OTP normally, but email-based invite acceptance requires them to add and verify the invited email first. Do not merge accounts automatically. A later phone-number invite can be interviewed separately. Development test mode must be server-gated to local environments only, never enabled by a browser flag, cloud deployment or production URL.</w:t>
       </w:r>
     </w:p>
     <w:p>
@@ -2526,7 +2526,7 @@
         <w:rPr>
           <w:b/>
         </w:rPr>
-        <w:t>Implementation order and proof gates after approval.</w:t>
+        <w:t>Approved implementation order and proof gates.</w:t>
       </w:r>
       <w:r>
         <w:t xml:space="preserve"> (1) Freeze the account matrix and permissions; spike local Convex and Better Auth feasibility. (2) Implement identity methods and server-side dev verification guard with unit, handler and adapter tests. (3) Add workspace roles and invite lifecycle with permission, concurrency and revocation tests. (4) Add signup, login, workspace and team screens using the current UI and translation contracts. (5) Create and seed the disposable fixture roster and generate the restricted annex. (6) Run real-browser paths, correct failures, and review visual captures. (7) Update the source user guide, rebuild and inspect its Word copy, then update the existing Google Doc with the same reviewed source and verify sharing. (8) Run </w:t>
@@ -2555,6 +2555,84 @@
     </w:p>
     <w:p>
       <w:pPr>
+        <w:pStyle w:val="Heading2"/>
+      </w:pPr>
+      <w:r>
+        <w:t>6 October 2026 launch test and account setup plan</w:t>
+      </w:r>
+    </w:p>
+    <w:p>
+      <w:r>
+        <w:t xml:space="preserve">The founder approved proceeding without another plan wait and requested a detailed testing document and every required account/API signup. The target launch decision is </w:t>
+      </w:r>
+      <w:r>
+        <w:rPr>
+          <w:b/>
+        </w:rPr>
+        <w:t>Saturday 10 October 2026, Asia/Kolkata</w:t>
+      </w:r>
+      <w:r>
+        <w:t xml:space="preserve">. The </w:t>
+      </w:r>
+      <w:hyperlink r:id="rId15">
+        <w:r>
+          <w:rPr>
+            <w:color w:val="175C73"/>
+            <w:u w:val="single"/>
+          </w:rPr>
+          <w:t>launch test plan</w:t>
+        </w:r>
+      </w:hyperlink>
+      <w:r>
+        <w:t xml:space="preserve"> and its editable Word copy </w:t>
+      </w:r>
+      <w:r>
+        <w:rPr>
+          <w:rFonts w:ascii="Liberation Mono" w:hAnsi="Liberation Mono"/>
+          <w:sz w:val="17"/>
+        </w:rPr>
+        <w:t>output/docx/luma-green-launch-test-plan.docx</w:t>
+      </w:r>
+      <w:r>
+        <w:t xml:space="preserve"> record the 6–10 October sequence, role roster, owner/admin/member/viewer checks, local-only verification, invite failure cases, material/PET journeys, provider gates, visual/language tests, result log, release criteria and rollback. No full role acceptance pass is claimed by preparing that plan.</w:t>
+      </w:r>
+    </w:p>
+    <w:p>
+      <w:r>
+        <w:t xml:space="preserve">Use the </w:t>
+      </w:r>
+      <w:hyperlink r:id="rId16">
+        <w:r>
+          <w:rPr>
+            <w:color w:val="175C73"/>
+            <w:u w:val="single"/>
+          </w:rPr>
+          <w:t>account checklist</w:t>
+        </w:r>
+      </w:hyperlink>
+      <w:r>
+        <w:t xml:space="preserve"> and </w:t>
+      </w:r>
+      <w:hyperlink r:id="rId17">
+        <w:r>
+          <w:rPr>
+            <w:color w:val="175C73"/>
+            <w:u w:val="single"/>
+          </w:rPr>
+          <w:t>service inventory</w:t>
+        </w:r>
+      </w:hyperlink>
+      <w:r>
+        <w:t>. Reuse GitHub, Convex, Vercel and domain access where available. Better Auth needs no separate hosted account. The approved production email path needs a verified Resend sender and API key; phone OTP needs MSG91/DLT approval. B2B gateway provider fit and onboarding remain open. Optional AI, telemetry, search, news, public data and native distribution accounts are required only for their enabled features. No new account has been created or verified by this entry.</w:t>
+      </w:r>
+    </w:p>
+    <w:p>
+      <w:r>
+        <w:t>Development test delivery and disposable credentials must stay strictly local. The restricted annex stays outside Git and the shared guide. After real-browser acceptance, update the existing Google user guide ID from the reviewed source and preserve its sharing. Both cloud Convex deployments remain paused until the validated release action. Saturday release is conditional on the exact tested scope and provider readiness; blocked flows stay listed. The founder must explicitly approve any smaller release scope rather than silently dropping work.</w:t>
+      </w:r>
+    </w:p>
+    <w:p>
+      <w:pPr>
         <w:pStyle w:val="Heading1"/>
       </w:pPr>
       <w:r>
@@ -2694,7 +2772,7 @@
       <w:r>
         <w:t xml:space="preserve">The founder clarified that GPS metadata embedded in photos is not needed. Location features must not depend on EXIF GPS data from a photo, including a photo transferred from a phone to a desktop. A transfer does not guarantee that metadata is removed: </w:t>
       </w:r>
-      <w:hyperlink r:id="rId15">
+      <w:hyperlink r:id="rId18">
         <w:r>
           <w:rPr>
             <w:color w:val="175C73"/>

</xml_diff>